<commit_message>
Feat: apply strict Humanizer rules to eliminate AI clichés, robotic punctuation and template formatting
</commit_message>
<xml_diff>
--- a/demo/output/article_mode_d_emploi.docx
+++ b/demo/output/article_mode_d_emploi.docx
@@ -4,20 +4,20 @@
   <w:body>
     <w:p>
       <w:pPr>
-        <w:spacing w:after="120"/>
+        <w:spacing w:after="80"/>
       </w:pPr>
       <w:r>
         <w:rPr>
           <w:b/>
           <w:color w:val="1E3A8A"/>
-          <w:sz w:val="48"/>
+          <w:sz w:val="44"/>
         </w:rPr>
-        <w:t>Guide Pratique &amp; Mode d'Emploi : Libérer Votre Potentiel Créatif</w:t>
+        <w:t>Stratégies pour Libérer le Potentiel Créatif</w:t>
       </w:r>
     </w:p>
     <w:p>
       <w:pPr>
-        <w:spacing w:after="400"/>
+        <w:spacing w:after="320"/>
       </w:pPr>
       <w:r>
         <w:rPr>
@@ -25,73 +25,8 @@
           <w:color w:val="64748B"/>
           <w:sz w:val="22"/>
         </w:rPr>
-        <w:t>Document de Synthèse Opérationnelle &amp; Pratique | Stratégies pour Innover dans un Monde Hyper-Connecté / Date / Client</w:t>
+        <w:t>Stratégies de créativité, 2023, Zoe Hames</w:t>
       </w:r>
-    </w:p>
-    <w:tbl>
-      <w:tblPr>
-        <w:tblW w:type="auto" w:w="0"/>
-        <w:jc w:val="center"/>
-        <w:tblLayout w:type="autofit"/>
-        <w:tblLook w:firstColumn="1" w:firstRow="1" w:lastColumn="0" w:lastRow="0" w:noHBand="0" w:noVBand="1" w:val="04A0"/>
-      </w:tblPr>
-      <w:tblGrid>
-        <w:gridCol w:w="3120"/>
-        <w:gridCol w:w="3120"/>
-        <w:gridCol w:w="3120"/>
-      </w:tblGrid>
-      <w:tr>
-        <w:tc>
-          <w:tcPr>
-            <w:tcW w:type="dxa" w:w="3120"/>
-            <w:shd w:fill="F1F5F9"/>
-          </w:tcPr>
-          <w:p>
-            <w:r>
-              <w:rPr>
-                <w:color w:val="64748B"/>
-                <w:sz w:val="19"/>
-              </w:rPr>
-              <w:t>Format : Guide Opérationnel</w:t>
-            </w:r>
-          </w:p>
-        </w:tc>
-        <w:tc>
-          <w:tcPr>
-            <w:tcW w:type="dxa" w:w="3120"/>
-            <w:shd w:fill="F1F5F9"/>
-          </w:tcPr>
-          <w:p>
-            <w:r>
-              <w:rPr>
-                <w:color w:val="64748B"/>
-                <w:sz w:val="19"/>
-              </w:rPr>
-              <w:t>Usage : Équipes &amp; Direction</w:t>
-            </w:r>
-          </w:p>
-        </w:tc>
-        <w:tc>
-          <w:tcPr>
-            <w:tcW w:type="dxa" w:w="3120"/>
-            <w:shd w:fill="F1F5F9"/>
-          </w:tcPr>
-          <w:p>
-            <w:r>
-              <w:rPr>
-                <w:color w:val="64748B"/>
-                <w:sz w:val="19"/>
-              </w:rPr>
-              <w:t>Origine : Restitution Vidéo</w:t>
-            </w:r>
-          </w:p>
-        </w:tc>
-      </w:tr>
-    </w:tbl>
-    <w:p>
-      <w:pPr>
-        <w:spacing w:after="280"/>
-      </w:pPr>
     </w:p>
     <w:p>
       <w:pPr>
@@ -104,7 +39,7 @@
           <w:color w:val="1E3A8A"/>
           <w:sz w:val="32"/>
         </w:rPr>
-        <w:t>1. Contexte &amp; Enjeux Stratégiques</w:t>
+        <w:t>Trouver le Calme dans le Tumulte</w:t>
       </w:r>
     </w:p>
     <w:p>
@@ -116,7 +51,7 @@
           <w:color w:val="334155"/>
           <w:sz w:val="22"/>
         </w:rPr>
-        <w:t>Dans un monde où l'information circule à une vitesse fulgurante, il est crucial de trouver des moyens de stimuler notre créativité.</w:t>
+        <w:t>Dans un monde bruyant, il est essentiel de créer des moments de silence. Ces instants permettent à l'inspiration de se manifester. Chris Lewis souligne que la surcharge de stimuli nous empêche d'écouter nos propres sens.</w:t>
       </w:r>
     </w:p>
     <w:p>
@@ -128,7 +63,7 @@
           <w:color w:val="334155"/>
           <w:sz w:val="22"/>
         </w:rPr>
-        <w:t>Chris Lewis, dans son livre *Too Fast to Think*, met en lumière les défis que pose cette hyper-connectivité sur notre capacité à innover.</w:t>
+        <w:t>Pour intégrer le calme dans notre quotidien, il est recommandé de dédier quelques minutes chaque jour à la déconnexion. Cela peut passer par une simple marche en nature ou un moment de méditation.</w:t>
       </w:r>
     </w:p>
     <w:p>
@@ -141,7 +76,7 @@
           <w:color w:val="334155"/>
           <w:sz w:val="21"/>
         </w:rPr>
-        <w:t>L'importance de la créativité dans un environnement professionnel compétitif.</w:t>
+        <w:t>Prendre du temps chaque jour pour se déconnecter et se recentrer.</w:t>
       </w:r>
     </w:p>
     <w:p>
@@ -154,7 +89,7 @@
           <w:color w:val="334155"/>
           <w:sz w:val="21"/>
         </w:rPr>
-        <w:t>Les effets néfastes du stress et de la surcharge d'informations sur la pensée créative.</w:t>
+        <w:t>Créer un espace propice à la réflexion loin des distractions numériques.</w:t>
       </w:r>
     </w:p>
     <w:tbl>
@@ -182,7 +117,7 @@
                 <w:color w:val="0284C7"/>
                 <w:sz w:val="20"/>
               </w:rPr>
-              <w:t>📌 Point de vigilance : Ne pas négliger le temps de déconnexion.</w:t>
+              <w:t>📌 L'importance de la tranquillité pour favoriser la créativité.</w:t>
             </w:r>
           </w:p>
         </w:tc>
@@ -258,7 +193,7 @@
           <w:color w:val="1E3A8A"/>
           <w:sz w:val="32"/>
         </w:rPr>
-        <w:t>2. Mode d'Emploi &amp; Démarche Pas-à-Pas</w:t>
+        <w:t>Exploiter la Puissance des Rêves</w:t>
       </w:r>
     </w:p>
     <w:p>
@@ -270,7 +205,7 @@
           <w:color w:val="334155"/>
           <w:sz w:val="22"/>
         </w:rPr>
-        <w:t>Pour libérer votre créativité, suivez ces trois stratégies clés :</w:t>
+        <w:t>Zoe Hames évoque l'importance de retrouver l'énergie imaginative de l'enfance. Cette approche consiste à laisser libre cours à son imagination, sans autocensure. Les idées les plus folles peuvent souvent mener à des innovations significatives.</w:t>
       </w:r>
     </w:p>
     <w:p>
@@ -282,31 +217,7 @@
           <w:color w:val="334155"/>
           <w:sz w:val="22"/>
         </w:rPr>
-        <w:t>1. **Trouver le Silence** : Accordez-vous des moments de calme pour réfléchir et laisser votre esprit vagabonder.</w:t>
-      </w:r>
-    </w:p>
-    <w:p>
-      <w:pPr>
-        <w:spacing w:line="288" w:lineRule="auto" w:after="160"/>
-      </w:pPr>
-      <w:r>
-        <w:rPr>
-          <w:color w:val="334155"/>
-          <w:sz w:val="22"/>
-        </w:rPr>
-        <w:t>2. **Exploiter le Pouvoir des Rêves** : Laissez libre cours à votre imagination sans jugement.</w:t>
-      </w:r>
-    </w:p>
-    <w:p>
-      <w:pPr>
-        <w:spacing w:line="288" w:lineRule="auto" w:after="160"/>
-      </w:pPr>
-      <w:r>
-        <w:rPr>
-          <w:color w:val="334155"/>
-          <w:sz w:val="22"/>
-        </w:rPr>
-        <w:t>3. **Lâcher Prise** : Acceptez l'imperfection et priorisez votre bien-être.</w:t>
+        <w:t>Pour accéder à cet état créatif, il est conseillé de se donner la permission de jouer et d'explorer sans limites.</w:t>
       </w:r>
     </w:p>
     <w:p>
@@ -319,7 +230,7 @@
           <w:color w:val="334155"/>
           <w:sz w:val="21"/>
         </w:rPr>
-        <w:t>Étape 1 : Créez des moments de silence dans votre journée.</w:t>
+        <w:t>Encourager le jeu et l'exploration d'idées sans jugement.</w:t>
       </w:r>
     </w:p>
     <w:p>
@@ -332,20 +243,7 @@
           <w:color w:val="334155"/>
           <w:sz w:val="21"/>
         </w:rPr>
-        <w:t>Étape 2 : Pratiquez des activités créatives sans contraintes.</w:t>
-      </w:r>
-    </w:p>
-    <w:p>
-      <w:pPr>
-        <w:pStyle w:val="ListBullet"/>
-        <w:spacing w:after="80"/>
-      </w:pPr>
-      <w:r>
-        <w:rPr>
-          <w:color w:val="334155"/>
-          <w:sz w:val="21"/>
-        </w:rPr>
-        <w:t>Étape 3 : Établissez des limites pour préserver votre énergie.</w:t>
+        <w:t>Noter toutes les pensées, même celles qui semblent irréalistes.</w:t>
       </w:r>
     </w:p>
     <w:tbl>
@@ -373,7 +271,7 @@
                 <w:color w:val="0284C7"/>
                 <w:sz w:val="20"/>
               </w:rPr>
-              <w:t>📌 Bonne pratique : Intégrez des pauses créatives dans votre emploi du temps.</w:t>
+              <w:t>📌 Les rêves peuvent offrir des insights précieux sur nos désirs et nos peurs.</w:t>
             </w:r>
           </w:p>
         </w:tc>
@@ -449,7 +347,7 @@
           <w:color w:val="1E3A8A"/>
           <w:sz w:val="32"/>
         </w:rPr>
-        <w:t>3. Décisions Clés &amp; Plan d'Action</w:t>
+        <w:t>L'Art de Lâcher Prise</w:t>
       </w:r>
     </w:p>
     <w:p>
@@ -461,7 +359,7 @@
           <w:color w:val="334155"/>
           <w:sz w:val="22"/>
         </w:rPr>
-        <w:t>Pour mettre en œuvre ces stratégies, il est essentiel de prendre des décisions conscientes sur votre emploi du temps et vos priorités.</w:t>
+        <w:t>La dernière stratégie aborde la nécessité de lâcher prise sur le besoin de contrôle. Zoe souligne que la créativité prospère dans un espace de confiance et de flexibilité. Il est crucial de prioriser ses besoins fondamentaux pour éviter l'épuisement.</w:t>
       </w:r>
     </w:p>
     <w:p>
@@ -473,7 +371,7 @@
           <w:color w:val="334155"/>
           <w:sz w:val="22"/>
         </w:rPr>
-        <w:t>Établissez un plan d'action qui inclut des moments de déconnexion, des activités créatives et des pratiques de bien-être.</w:t>
+        <w:t>Accepter de ne pas tout maîtriser permet de se concentrer sur ce qui nourrit notre créativité.</w:t>
       </w:r>
     </w:p>
     <w:p>
@@ -486,7 +384,7 @@
           <w:color w:val="334155"/>
           <w:sz w:val="21"/>
         </w:rPr>
-        <w:t>Action 1 : Planifiez des pauses régulières dans votre journée.</w:t>
+        <w:t>Établir des limites et dire non aux engagements qui drainent notre énergie.</w:t>
       </w:r>
     </w:p>
     <w:p>
@@ -499,7 +397,97 @@
           <w:color w:val="334155"/>
           <w:sz w:val="21"/>
         </w:rPr>
-        <w:t>Action 2 : Engagez-vous dans des activités qui nourrissent votre créativité.</w:t>
+        <w:t>Prendre soin de soi pour permettre à la créativité de s'épanouir.</w:t>
+      </w:r>
+    </w:p>
+    <w:tbl>
+      <w:tblPr>
+        <w:tblW w:type="auto" w:w="0"/>
+        <w:jc w:val="center"/>
+        <w:tblLook w:firstColumn="1" w:firstRow="1" w:lastColumn="0" w:lastRow="0" w:noHBand="0" w:noVBand="1" w:val="04A0"/>
+      </w:tblPr>
+      <w:tblGrid>
+        <w:gridCol w:w="9360"/>
+      </w:tblGrid>
+      <w:tr>
+        <w:tc>
+          <w:tcPr>
+            <w:tcW w:type="dxa" w:w="9360"/>
+            <w:shd w:fill="EFF6FF"/>
+          </w:tcPr>
+          <w:p>
+            <w:pPr>
+              <w:spacing w:after="40"/>
+            </w:pPr>
+            <w:r>
+              <w:rPr>
+                <w:i/>
+                <w:color w:val="0284C7"/>
+                <w:sz w:val="20"/>
+              </w:rPr>
+              <w:t>📌 Le bien-être personnel est essentiel pour favoriser la créativité.</w:t>
+            </w:r>
+          </w:p>
+        </w:tc>
+      </w:tr>
+    </w:tbl>
+    <w:p>
+      <w:pPr>
+        <w:spacing w:after="160"/>
+      </w:pPr>
+    </w:p>
+    <w:p>
+      <w:pPr>
+        <w:spacing w:before="160" w:after="80"/>
+        <w:jc w:val="center"/>
+      </w:pPr>
+      <w:r>
+        <w:drawing>
+          <wp:inline xmlns:a="http://schemas.openxmlformats.org/drawingml/2006/main" xmlns:pic="http://schemas.openxmlformats.org/drawingml/2006/picture">
+            <wp:extent cx="5029200" cy="2826717"/>
+            <wp:docPr id="3" name="Picture 3"/>
+            <wp:cNvGraphicFramePr>
+              <a:graphicFrameLocks noChangeAspect="1"/>
+            </wp:cNvGraphicFramePr>
+            <a:graphic>
+              <a:graphicData uri="http://schemas.openxmlformats.org/drawingml/2006/picture">
+                <pic:pic>
+                  <pic:nvPicPr>
+                    <pic:cNvPr id="0" name="slide_keyframe_03.jpg"/>
+                    <pic:cNvPicPr/>
+                  </pic:nvPicPr>
+                  <pic:blipFill>
+                    <a:blip r:embed="rId11"/>
+                    <a:stretch>
+                      <a:fillRect/>
+                    </a:stretch>
+                  </pic:blipFill>
+                  <pic:spPr>
+                    <a:xfrm>
+                      <a:off x="0" y="0"/>
+                      <a:ext cx="5029200" cy="2826717"/>
+                    </a:xfrm>
+                    <a:prstGeom prst="rect"/>
+                  </pic:spPr>
+                </pic:pic>
+              </a:graphicData>
+            </a:graphic>
+          </wp:inline>
+        </w:drawing>
+      </w:r>
+    </w:p>
+    <w:p>
+      <w:pPr>
+        <w:spacing w:after="240"/>
+        <w:jc w:val="center"/>
+      </w:pPr>
+      <w:r>
+        <w:rPr>
+          <w:i/>
+          <w:color w:val="64748B"/>
+          <w:sz w:val="18"/>
+        </w:rPr>
+        <w:t>Illustration : slide_keyframe_03.jpg</w:t>
       </w:r>
     </w:p>
     <w:sectPr>

</xml_diff>

<commit_message>
Fix: finalize Windows batch installers syntax with CRLF, clean explorer launch and exit codes
</commit_message>
<xml_diff>
--- a/demo/output/article_mode_d_emploi.docx
+++ b/demo/output/article_mode_d_emploi.docx
@@ -12,7 +12,7 @@
           <w:color w:val="1E3A8A"/>
           <w:sz w:val="44"/>
         </w:rPr>
-        <w:t>Stratégies pour Libérer le Potentiel Créatif</w:t>
+        <w:t>Stratégies pour Développer la Créativité</w:t>
       </w:r>
     </w:p>
     <w:p>
@@ -51,7 +51,7 @@
           <w:color w:val="334155"/>
           <w:sz w:val="22"/>
         </w:rPr>
-        <w:t>Dans un monde bruyant, il est essentiel de créer des moments de silence. Ces instants permettent à l'inspiration de se manifester. Chris Lewis souligne que la surcharge de stimuli nous empêche d'écouter nos propres sens.</w:t>
+        <w:t>Zoe Hames souligne l'importance de moments de silence pour stimuler la créativité. Dans un monde bruyant, ces instants permettent de se reconnecter à soi-même et d'accueillir l'inspiration.</w:t>
       </w:r>
     </w:p>
     <w:p>
@@ -63,7 +63,7 @@
           <w:color w:val="334155"/>
           <w:sz w:val="22"/>
         </w:rPr>
-        <w:t>Pour intégrer le calme dans notre quotidien, il est recommandé de dédier quelques minutes chaque jour à la déconnexion. Cela peut passer par une simple marche en nature ou un moment de méditation.</w:t>
+        <w:t>Elle évoque l'exemple de Gamora, qui a besoin de concentration pour maîtriser son art. De même, la créativité nécessite un espace pour se développer, loin des distractions.</w:t>
       </w:r>
     </w:p>
     <w:p>
@@ -76,7 +76,7 @@
           <w:color w:val="334155"/>
           <w:sz w:val="21"/>
         </w:rPr>
-        <w:t>Prendre du temps chaque jour pour se déconnecter et se recentrer.</w:t>
+        <w:t>Consacrer quelques minutes chaque jour à la déconnexion.</w:t>
       </w:r>
     </w:p>
     <w:p>
@@ -89,7 +89,7 @@
           <w:color w:val="334155"/>
           <w:sz w:val="21"/>
         </w:rPr>
-        <w:t>Créer un espace propice à la réflexion loin des distractions numériques.</w:t>
+        <w:t>Pratiquer des activités apaisantes comme la marche en nature ou la méditation.</w:t>
       </w:r>
     </w:p>
     <w:tbl>
@@ -117,7 +117,7 @@
                 <w:color w:val="0284C7"/>
                 <w:sz w:val="20"/>
               </w:rPr>
-              <w:t>📌 L'importance de la tranquillité pour favoriser la créativité.</w:t>
+              <w:t>📌 L'importance de créer des moments de silence pour favoriser l'inspiration.</w:t>
             </w:r>
           </w:p>
         </w:tc>
@@ -205,7 +205,7 @@
           <w:color w:val="334155"/>
           <w:sz w:val="22"/>
         </w:rPr>
-        <w:t>Zoe Hames évoque l'importance de retrouver l'énergie imaginative de l'enfance. Cette approche consiste à laisser libre cours à son imagination, sans autocensure. Les idées les plus folles peuvent souvent mener à des innovations significatives.</w:t>
+        <w:t>La deuxième stratégie consiste à se reconnecter à l'énergie imaginative que nous avions enfants. Zoe encourage à laisser libre cours à son imagination sans jugement.</w:t>
       </w:r>
     </w:p>
     <w:p>
@@ -217,7 +217,7 @@
           <w:color w:val="334155"/>
           <w:sz w:val="22"/>
         </w:rPr>
-        <w:t>Pour accéder à cet état créatif, il est conseillé de se donner la permission de jouer et d'explorer sans limites.</w:t>
+        <w:t>Elle rappelle que les idées les plus folles peuvent être à l'origine d'innovations significatives.</w:t>
       </w:r>
     </w:p>
     <w:p>
@@ -230,7 +230,7 @@
           <w:color w:val="334155"/>
           <w:sz w:val="21"/>
         </w:rPr>
-        <w:t>Encourager le jeu et l'exploration d'idées sans jugement.</w:t>
+        <w:t>Accorder du temps pour jouer et explorer des idées sans contraintes.</w:t>
       </w:r>
     </w:p>
     <w:p>
@@ -243,7 +243,7 @@
           <w:color w:val="334155"/>
           <w:sz w:val="21"/>
         </w:rPr>
-        <w:t>Noter toutes les pensées, même celles qui semblent irréalistes.</w:t>
+        <w:t>Tenir un journal pour noter toutes les pensées, même les plus improbables.</w:t>
       </w:r>
     </w:p>
     <w:tbl>
@@ -271,7 +271,7 @@
                 <w:color w:val="0284C7"/>
                 <w:sz w:val="20"/>
               </w:rPr>
-              <w:t>📌 Les rêves peuvent offrir des insights précieux sur nos désirs et nos peurs.</w:t>
+              <w:t>📌 Les rêves, qu'ils soient éveillés ou endormis, peuvent offrir des aperçus précieux sur notre créativité.</w:t>
             </w:r>
           </w:p>
         </w:tc>
@@ -359,7 +359,7 @@
           <w:color w:val="334155"/>
           <w:sz w:val="22"/>
         </w:rPr>
-        <w:t>La dernière stratégie aborde la nécessité de lâcher prise sur le besoin de contrôle. Zoe souligne que la créativité prospère dans un espace de confiance et de flexibilité. Il est crucial de prioriser ses besoins fondamentaux pour éviter l'épuisement.</w:t>
+        <w:t>Zoe aborde ensuite l'importance de lâcher prise pour libérer la créativité. Elle explique que la pression de la perfection peut étouffer l'innovation.</w:t>
       </w:r>
     </w:p>
     <w:p>
@@ -371,7 +371,7 @@
           <w:color w:val="334155"/>
           <w:sz w:val="22"/>
         </w:rPr>
-        <w:t>Accepter de ne pas tout maîtriser permet de se concentrer sur ce qui nourrit notre créativité.</w:t>
+        <w:t>Elle insiste sur le fait que prendre soin de soi est essentiel pour maintenir un flux créatif.</w:t>
       </w:r>
     </w:p>
     <w:p>
@@ -384,7 +384,7 @@
           <w:color w:val="334155"/>
           <w:sz w:val="21"/>
         </w:rPr>
-        <w:t>Établir des limites et dire non aux engagements qui drainent notre énergie.</w:t>
+        <w:t>Établir des limites pour protéger son énergie.</w:t>
       </w:r>
     </w:p>
     <w:p>
@@ -397,7 +397,7 @@
           <w:color w:val="334155"/>
           <w:sz w:val="21"/>
         </w:rPr>
-        <w:t>Prendre soin de soi pour permettre à la créativité de s'épanouir.</w:t>
+        <w:t>Prioriser des activités qui apportent de la joie et permettent de se ressourcer.</w:t>
       </w:r>
     </w:p>
     <w:tbl>
@@ -425,7 +425,7 @@
                 <w:color w:val="0284C7"/>
                 <w:sz w:val="20"/>
               </w:rPr>
-              <w:t>📌 Le bien-être personnel est essentiel pour favoriser la créativité.</w:t>
+              <w:t>📌 Lâcher prise permet de retrouver un espace créatif fertile.</w:t>
             </w:r>
           </w:p>
         </w:tc>

</xml_diff>

<commit_message>
feat: actualisation des livrables après exécution du test en conditions réelles
</commit_message>
<xml_diff>
--- a/demo/output/article_mode_d_emploi.docx
+++ b/demo/output/article_mode_d_emploi.docx
@@ -12,7 +12,7 @@
           <w:color w:val="1E3A8A"/>
           <w:sz w:val="44"/>
         </w:rPr>
-        <w:t>Stratégies pour Développer la Créativité</w:t>
+        <w:t>Stratégies pour Libérer le Potentiel Créatif</w:t>
       </w:r>
     </w:p>
     <w:p>
@@ -25,7 +25,7 @@
           <w:color w:val="64748B"/>
           <w:sz w:val="22"/>
         </w:rPr>
-        <w:t>Stratégies de créativité, 2023, Zoe Hames</w:t>
+        <w:t>Stratégies de créativité, 2023, Zoe Hames et Chris Lewis</w:t>
       </w:r>
     </w:p>
     <w:p>
@@ -39,7 +39,7 @@
           <w:color w:val="1E3A8A"/>
           <w:sz w:val="32"/>
         </w:rPr>
-        <w:t>Trouver le Calme dans le Tumulte</w:t>
+        <w:t>Trouver le Calme dans le Chaos</w:t>
       </w:r>
     </w:p>
     <w:p>
@@ -51,7 +51,7 @@
           <w:color w:val="334155"/>
           <w:sz w:val="22"/>
         </w:rPr>
-        <w:t>Zoe Hames souligne l'importance de moments de silence pour stimuler la créativité. Dans un monde bruyant, ces instants permettent de se reconnecter à soi-même et d'accueillir l'inspiration.</w:t>
+        <w:t>Zoe Hames évoque l'importance de moments de silence pour stimuler la créativité. Dans un monde bruyant, il est essentiel de se déconnecter des distractions pour permettre à l'esprit de s'épanouir.</w:t>
       </w:r>
     </w:p>
     <w:p>
@@ -63,7 +63,7 @@
           <w:color w:val="334155"/>
           <w:sz w:val="22"/>
         </w:rPr>
-        <w:t>Elle évoque l'exemple de Gamora, qui a besoin de concentration pour maîtriser son art. De même, la créativité nécessite un espace pour se développer, loin des distractions.</w:t>
+        <w:t>Elle fait référence à Gamora, qui a besoin de concentration pour maîtriser son art. De même, la créativité nécessite un espace pour respirer, loin des bruits incessants.</w:t>
       </w:r>
     </w:p>
     <w:p>
@@ -76,7 +76,7 @@
           <w:color w:val="334155"/>
           <w:sz w:val="21"/>
         </w:rPr>
-        <w:t>Consacrer quelques minutes chaque jour à la déconnexion.</w:t>
+        <w:t>Prendre quelques minutes chaque jour pour se déconnecter et se recentrer.</w:t>
       </w:r>
     </w:p>
     <w:p>
@@ -89,7 +89,7 @@
           <w:color w:val="334155"/>
           <w:sz w:val="21"/>
         </w:rPr>
-        <w:t>Pratiquer des activités apaisantes comme la marche en nature ou la méditation.</w:t>
+        <w:t>Se promener dans la nature ou méditer pour favoriser la réflexion.</w:t>
       </w:r>
     </w:p>
     <w:tbl>
@@ -205,7 +205,7 @@
           <w:color w:val="334155"/>
           <w:sz w:val="22"/>
         </w:rPr>
-        <w:t>La deuxième stratégie consiste à se reconnecter à l'énergie imaginative que nous avions enfants. Zoe encourage à laisser libre cours à son imagination sans jugement.</w:t>
+        <w:t>La deuxième stratégie consiste à libérer l'imagination en se reconnectant à l'énergie créative de l'enfance. Zoe encourage à laisser libre cours à ses pensées sans autocensure.</w:t>
       </w:r>
     </w:p>
     <w:p>
@@ -217,7 +217,7 @@
           <w:color w:val="334155"/>
           <w:sz w:val="22"/>
         </w:rPr>
-        <w:t>Elle rappelle que les idées les plus folles peuvent être à l'origine d'innovations significatives.</w:t>
+        <w:t>Chris Lewis souligne que les idées les plus innovantes peuvent émerger de pensées jugées absurdes. Il est donc crucial d'explorer ces pistes.</w:t>
       </w:r>
     </w:p>
     <w:p>
@@ -230,7 +230,7 @@
           <w:color w:val="334155"/>
           <w:sz w:val="21"/>
         </w:rPr>
-        <w:t>Accorder du temps pour jouer et explorer des idées sans contraintes.</w:t>
+        <w:t>Doodle et écrire sans se soucier de la logique ou de la perfection.</w:t>
       </w:r>
     </w:p>
     <w:p>
@@ -243,7 +243,7 @@
           <w:color w:val="334155"/>
           <w:sz w:val="21"/>
         </w:rPr>
-        <w:t>Tenir un journal pour noter toutes les pensées, même les plus improbables.</w:t>
+        <w:t>Accorder de l'importance aux rêves, qui peuvent révéler des désirs cachés.</w:t>
       </w:r>
     </w:p>
     <w:tbl>
@@ -271,7 +271,7 @@
                 <w:color w:val="0284C7"/>
                 <w:sz w:val="20"/>
               </w:rPr>
-              <w:t>📌 Les rêves, qu'ils soient éveillés ou endormis, peuvent offrir des aperçus précieux sur notre créativité.</w:t>
+              <w:t>📌 Encourager le jeu et l'exploration des idées sans limites.</w:t>
             </w:r>
           </w:p>
         </w:tc>
@@ -359,7 +359,7 @@
           <w:color w:val="334155"/>
           <w:sz w:val="22"/>
         </w:rPr>
-        <w:t>Zoe aborde ensuite l'importance de lâcher prise pour libérer la créativité. Elle explique que la pression de la perfection peut étouffer l'innovation.</w:t>
+        <w:t>Zoe aborde ensuite la nécessité de lâcher prise pour favoriser la créativité. Elle explique que la pression de la perfection peut étouffer l'innovation.</w:t>
       </w:r>
     </w:p>
     <w:p>
@@ -371,7 +371,7 @@
           <w:color w:val="334155"/>
           <w:sz w:val="22"/>
         </w:rPr>
-        <w:t>Elle insiste sur le fait que prendre soin de soi est essentiel pour maintenir un flux créatif.</w:t>
+        <w:t>Chris Lewis insiste sur l'importance de prendre soin de soi pour maintenir un esprit créatif. Lorsque nous sommes épuisés, notre créativité en souffre.</w:t>
       </w:r>
     </w:p>
     <w:p>
@@ -384,7 +384,7 @@
           <w:color w:val="334155"/>
           <w:sz w:val="21"/>
         </w:rPr>
-        <w:t>Établir des limites pour protéger son énergie.</w:t>
+        <w:t>Établir des limites et apprendre à dire non aux engagements qui drainent l'énergie.</w:t>
       </w:r>
     </w:p>
     <w:p>
@@ -397,7 +397,7 @@
           <w:color w:val="334155"/>
           <w:sz w:val="21"/>
         </w:rPr>
-        <w:t>Prioriser des activités qui apportent de la joie et permettent de se ressourcer.</w:t>
+        <w:t>Faire des activités qui apportent de la joie et permettent de se ressourcer.</w:t>
       </w:r>
     </w:p>
     <w:tbl>
@@ -425,7 +425,7 @@
                 <w:color w:val="0284C7"/>
                 <w:sz w:val="20"/>
               </w:rPr>
-              <w:t>📌 Lâcher prise permet de retrouver un espace créatif fertile.</w:t>
+              <w:t>📌 Prioriser le bien-être pour nourrir la créativité.</w:t>
             </w:r>
           </w:p>
         </w:tc>

</xml_diff>

<commit_message>
docs: humanisation des README et intégration du guide de sélection interactive
</commit_message>
<xml_diff>
--- a/demo/output/article_mode_d_emploi.docx
+++ b/demo/output/article_mode_d_emploi.docx
@@ -12,7 +12,7 @@
           <w:color w:val="1E3A8A"/>
           <w:sz w:val="44"/>
         </w:rPr>
-        <w:t>Stratégies pour Libérer le Potentiel Créatif</w:t>
+        <w:t>Stratégies pour Développer la Créativité</w:t>
       </w:r>
     </w:p>
     <w:p>
@@ -25,7 +25,7 @@
           <w:color w:val="64748B"/>
           <w:sz w:val="22"/>
         </w:rPr>
-        <w:t>Stratégies de créativité, 2023, Zoe Hames et Chris Lewis</w:t>
+        <w:t>Stratégies de créativité, 2023, Zoe Hames</w:t>
       </w:r>
     </w:p>
     <w:p>
@@ -39,7 +39,7 @@
           <w:color w:val="1E3A8A"/>
           <w:sz w:val="32"/>
         </w:rPr>
-        <w:t>Trouver le Calme dans le Chaos</w:t>
+        <w:t>Trouver le Calme</w:t>
       </w:r>
     </w:p>
     <w:p>
@@ -51,7 +51,7 @@
           <w:color w:val="334155"/>
           <w:sz w:val="22"/>
         </w:rPr>
-        <w:t>Zoe Hames évoque l'importance de moments de silence pour stimuler la créativité. Dans un monde bruyant, il est essentiel de se déconnecter des distractions pour permettre à l'esprit de s'épanouir.</w:t>
+        <w:t>Dans un monde où le bruit est omniprésent, il est essentiel de créer des moments de silence. Ces instants permettent à l'esprit de se recentrer et d'accueillir l'inspiration.</w:t>
       </w:r>
     </w:p>
     <w:p>
@@ -63,7 +63,7 @@
           <w:color w:val="334155"/>
           <w:sz w:val="22"/>
         </w:rPr>
-        <w:t>Elle fait référence à Gamora, qui a besoin de concentration pour maîtriser son art. De même, la créativité nécessite un espace pour respirer, loin des bruits incessants.</w:t>
+        <w:t>Zoe évoque l'exemple de Gamora, qui a dû se concentrer intensément pour maîtriser son art. De même, la créativité nécessite un espace pour se développer, loin des distractions.</w:t>
       </w:r>
     </w:p>
     <w:p>
@@ -76,7 +76,7 @@
           <w:color w:val="334155"/>
           <w:sz w:val="21"/>
         </w:rPr>
-        <w:t>Prendre quelques minutes chaque jour pour se déconnecter et se recentrer.</w:t>
+        <w:t>Consacrer quelques minutes chaque jour à la déconnexion.</w:t>
       </w:r>
     </w:p>
     <w:p>
@@ -89,7 +89,7 @@
           <w:color w:val="334155"/>
           <w:sz w:val="21"/>
         </w:rPr>
-        <w:t>Se promener dans la nature ou méditer pour favoriser la réflexion.</w:t>
+        <w:t>Prendre des pauses en pleine nature pour se reconnecter à soi-même.</w:t>
       </w:r>
     </w:p>
     <w:tbl>
@@ -117,7 +117,7 @@
                 <w:color w:val="0284C7"/>
                 <w:sz w:val="20"/>
               </w:rPr>
-              <w:t>📌 L'importance de créer des moments de silence pour favoriser l'inspiration.</w:t>
+              <w:t>📌 L'importance de la tranquillité pour stimuler la créativité.</w:t>
             </w:r>
           </w:p>
         </w:tc>
@@ -205,7 +205,7 @@
           <w:color w:val="334155"/>
           <w:sz w:val="22"/>
         </w:rPr>
-        <w:t>La deuxième stratégie consiste à libérer l'imagination en se reconnectant à l'énergie créative de l'enfance. Zoe encourage à laisser libre cours à ses pensées sans autocensure.</w:t>
+        <w:t>Zoe souligne l'importance de retrouver l'énergie imaginative de l'enfance. Elle encourage à laisser libre cours à l'imagination, sans jugement ni limites.</w:t>
       </w:r>
     </w:p>
     <w:p>
@@ -217,7 +217,7 @@
           <w:color w:val="334155"/>
           <w:sz w:val="22"/>
         </w:rPr>
-        <w:t>Chris Lewis souligne que les idées les plus innovantes peuvent émerger de pensées jugées absurdes. Il est donc crucial d'explorer ces pistes.</w:t>
+        <w:t>Les rêves, qu'ils soient nocturnes ou éveillés, peuvent offrir des aperçus précieux sur nos désirs et nos peurs, alimentant ainsi notre créativité.</w:t>
       </w:r>
     </w:p>
     <w:p>
@@ -230,7 +230,7 @@
           <w:color w:val="334155"/>
           <w:sz w:val="21"/>
         </w:rPr>
-        <w:t>Doodle et écrire sans se soucier de la logique ou de la perfection.</w:t>
+        <w:t>Accorder du temps à des activités ludiques et créatives.</w:t>
       </w:r>
     </w:p>
     <w:p>
@@ -243,7 +243,7 @@
           <w:color w:val="334155"/>
           <w:sz w:val="21"/>
         </w:rPr>
-        <w:t>Accorder de l'importance aux rêves, qui peuvent révéler des désirs cachés.</w:t>
+        <w:t>Écrire librement sans se soucier de la cohérence.</w:t>
       </w:r>
     </w:p>
     <w:tbl>
@@ -271,7 +271,7 @@
                 <w:color w:val="0284C7"/>
                 <w:sz w:val="20"/>
               </w:rPr>
-              <w:t>📌 Encourager le jeu et l'exploration des idées sans limites.</w:t>
+              <w:t>📌 Les rêves comme source d'inspiration et d'innovation.</w:t>
             </w:r>
           </w:p>
         </w:tc>
@@ -347,7 +347,7 @@
           <w:color w:val="1E3A8A"/>
           <w:sz w:val="32"/>
         </w:rPr>
-        <w:t>L'Art de Lâcher Prise</w:t>
+        <w:t>Apprendre à Lâcher Prise</w:t>
       </w:r>
     </w:p>
     <w:p>
@@ -359,7 +359,7 @@
           <w:color w:val="334155"/>
           <w:sz w:val="22"/>
         </w:rPr>
-        <w:t>Zoe aborde ensuite la nécessité de lâcher prise pour favoriser la créativité. Elle explique que la pression de la perfection peut étouffer l'innovation.</w:t>
+        <w:t>Zoe aborde la nécessité de se libérer du besoin de tout contrôler. Elle explique que la créativité prospère dans l'acceptation et la flexibilité.</w:t>
       </w:r>
     </w:p>
     <w:p>
@@ -371,7 +371,7 @@
           <w:color w:val="334155"/>
           <w:sz w:val="22"/>
         </w:rPr>
-        <w:t>Chris Lewis insiste sur l'importance de prendre soin de soi pour maintenir un esprit créatif. Lorsque nous sommes épuisés, notre créativité en souffre.</w:t>
+        <w:t>Il est crucial de prioriser son bien-être pour nourrir sa créativité, en évitant de s'épuiser dans la quête de la perfection.</w:t>
       </w:r>
     </w:p>
     <w:p>
@@ -384,7 +384,7 @@
           <w:color w:val="334155"/>
           <w:sz w:val="21"/>
         </w:rPr>
-        <w:t>Établir des limites et apprendre à dire non aux engagements qui drainent l'énergie.</w:t>
+        <w:t>Établir des limites pour préserver son énergie.</w:t>
       </w:r>
     </w:p>
     <w:p>
@@ -397,7 +397,7 @@
           <w:color w:val="334155"/>
           <w:sz w:val="21"/>
         </w:rPr>
-        <w:t>Faire des activités qui apportent de la joie et permettent de se ressourcer.</w:t>
+        <w:t>Accorder du temps à des activités qui apportent de la joie.</w:t>
       </w:r>
     </w:p>
     <w:tbl>
@@ -425,7 +425,7 @@
                 <w:color w:val="0284C7"/>
                 <w:sz w:val="20"/>
               </w:rPr>
-              <w:t>📌 Prioriser le bien-être pour nourrir la créativité.</w:t>
+              <w:t>📌 Lâcher prise comme clé pour libérer la créativité.</w:t>
             </w:r>
           </w:p>
         </w:tc>

</xml_diff>

<commit_message>
feat: support du téléchargement automatique Google Drive et sélection interactive de vidéo
</commit_message>
<xml_diff>
--- a/demo/output/article_mode_d_emploi.docx
+++ b/demo/output/article_mode_d_emploi.docx
@@ -25,7 +25,7 @@
           <w:color w:val="64748B"/>
           <w:sz w:val="22"/>
         </w:rPr>
-        <w:t>Stratégies de créativité, 2023, Zoe Hames</w:t>
+        <w:t>Stratégies de créativité, date, Zoe Hames et Chris Lewis</w:t>
       </w:r>
     </w:p>
     <w:p>
@@ -39,7 +39,7 @@
           <w:color w:val="1E3A8A"/>
           <w:sz w:val="32"/>
         </w:rPr>
-        <w:t>Trouver le Calme</w:t>
+        <w:t>Trouver le Silence dans le Chaos</w:t>
       </w:r>
     </w:p>
     <w:p>
@@ -51,7 +51,7 @@
           <w:color w:val="334155"/>
           <w:sz w:val="22"/>
         </w:rPr>
-        <w:t>Dans un monde où le bruit est omniprésent, il est essentiel de créer des moments de silence. Ces instants permettent à l'esprit de se recentrer et d'accueillir l'inspiration.</w:t>
+        <w:t>Zoe Hames insiste sur la nécessité de moments de calme pour favoriser la créativité. Dans un monde bruyant, le silence devient essentiel pour laisser place à l'inspiration.</w:t>
       </w:r>
     </w:p>
     <w:p>
@@ -63,7 +63,7 @@
           <w:color w:val="334155"/>
           <w:sz w:val="22"/>
         </w:rPr>
-        <w:t>Zoe évoque l'exemple de Gamora, qui a dû se concentrer intensément pour maîtriser son art. De même, la créativité nécessite un espace pour se développer, loin des distractions.</w:t>
+        <w:t>Elle évoque l'exemple de Gamora, qui a dû se concentrer intensément pour maîtriser son art. De même, la créativité nécessite un espace pour se développer, loin des distractions.</w:t>
       </w:r>
     </w:p>
     <w:p>
@@ -89,7 +89,7 @@
           <w:color w:val="334155"/>
           <w:sz w:val="21"/>
         </w:rPr>
-        <w:t>Prendre des pauses en pleine nature pour se reconnecter à soi-même.</w:t>
+        <w:t>Prendre des promenades dans la nature pour se reconnecter aux sensations.</w:t>
       </w:r>
     </w:p>
     <w:tbl>
@@ -117,7 +117,7 @@
                 <w:color w:val="0284C7"/>
                 <w:sz w:val="20"/>
               </w:rPr>
-              <w:t>📌 L'importance de la tranquillité pour stimuler la créativité.</w:t>
+              <w:t>📌 Créer des moments de silence aide à libérer l'esprit.</w:t>
             </w:r>
           </w:p>
         </w:tc>
@@ -193,7 +193,7 @@
           <w:color w:val="1E3A8A"/>
           <w:sz w:val="32"/>
         </w:rPr>
-        <w:t>Exploiter la Puissance des Rêves</w:t>
+        <w:t>Exploiter le Pouvoir des Rêves</w:t>
       </w:r>
     </w:p>
     <w:p>
@@ -205,7 +205,7 @@
           <w:color w:val="334155"/>
           <w:sz w:val="22"/>
         </w:rPr>
-        <w:t>Zoe souligne l'importance de retrouver l'énergie imaginative de l'enfance. Elle encourage à laisser libre cours à l'imagination, sans jugement ni limites.</w:t>
+        <w:t>Zoe Hames encourage à retrouver l'énergie imaginative de l'enfance. Elle souligne l'importance de laisser libre cours à ses pensées sans jugement.</w:t>
       </w:r>
     </w:p>
     <w:p>
@@ -217,7 +217,7 @@
           <w:color w:val="334155"/>
           <w:sz w:val="22"/>
         </w:rPr>
-        <w:t>Les rêves, qu'ils soient nocturnes ou éveillés, peuvent offrir des aperçus précieux sur nos désirs et nos peurs, alimentant ainsi notre créativité.</w:t>
+        <w:t>Les idées les plus folles peuvent mener à des innovations significatives. En se permettant de rêver, on peut découvrir des trésors cachés dans notre créativité.</w:t>
       </w:r>
     </w:p>
     <w:p>
@@ -230,7 +230,7 @@
           <w:color w:val="334155"/>
           <w:sz w:val="21"/>
         </w:rPr>
-        <w:t>Accorder du temps à des activités ludiques et créatives.</w:t>
+        <w:t>Doodler, rêver éveillé et noter toutes les idées, même les plus absurdes.</w:t>
       </w:r>
     </w:p>
     <w:p>
@@ -243,7 +243,7 @@
           <w:color w:val="334155"/>
           <w:sz w:val="21"/>
         </w:rPr>
-        <w:t>Écrire librement sans se soucier de la cohérence.</w:t>
+        <w:t>Explorer son imagination comme un univers à découvrir.</w:t>
       </w:r>
     </w:p>
     <w:tbl>
@@ -271,7 +271,7 @@
                 <w:color w:val="0284C7"/>
                 <w:sz w:val="20"/>
               </w:rPr>
-              <w:t>📌 Les rêves comme source d'inspiration et d'innovation.</w:t>
+              <w:t>📌 Les rêves peuvent révéler des désirs et des peurs cachés.</w:t>
             </w:r>
           </w:p>
         </w:tc>
@@ -347,7 +347,7 @@
           <w:color w:val="1E3A8A"/>
           <w:sz w:val="32"/>
         </w:rPr>
-        <w:t>Apprendre à Lâcher Prise</w:t>
+        <w:t>L'Art de Laisser Aller</w:t>
       </w:r>
     </w:p>
     <w:p>
@@ -359,7 +359,7 @@
           <w:color w:val="334155"/>
           <w:sz w:val="22"/>
         </w:rPr>
-        <w:t>Zoe aborde la nécessité de se libérer du besoin de tout contrôler. Elle explique que la créativité prospère dans l'acceptation et la flexibilité.</w:t>
+        <w:t>Zoe Hames aborde l'importance de lâcher prise pour favoriser la créativité. Elle explique que parfois, il faut accepter de ne pas tout contrôler.</w:t>
       </w:r>
     </w:p>
     <w:p>
@@ -371,7 +371,7 @@
           <w:color w:val="334155"/>
           <w:sz w:val="22"/>
         </w:rPr>
-        <w:t>Il est crucial de prioriser son bien-être pour nourrir sa créativité, en évitant de s'épuiser dans la quête de la perfection.</w:t>
+        <w:t>En priorisant nos besoins fondamentaux, comme le sommeil et la nutrition, nous créons un environnement où la créativité peut s'épanouir.</w:t>
       </w:r>
     </w:p>
     <w:p>
@@ -384,7 +384,7 @@
           <w:color w:val="334155"/>
           <w:sz w:val="21"/>
         </w:rPr>
-        <w:t>Établir des limites pour préserver son énergie.</w:t>
+        <w:t>Établir des limites et dire non aux activités épuisantes.</w:t>
       </w:r>
     </w:p>
     <w:p>
@@ -397,7 +397,7 @@
           <w:color w:val="334155"/>
           <w:sz w:val="21"/>
         </w:rPr>
-        <w:t>Accorder du temps à des activités qui apportent de la joie.</w:t>
+        <w:t>Accorder du temps à des activités joyeuses qui nourrissent l'âme.</w:t>
       </w:r>
     </w:p>
     <w:tbl>
@@ -425,7 +425,7 @@
                 <w:color w:val="0284C7"/>
                 <w:sz w:val="20"/>
               </w:rPr>
-              <w:t>📌 Lâcher prise comme clé pour libérer la créativité.</w:t>
+              <w:t>📌 Prendre soin de soi est essentiel pour libérer sa créativité.</w:t>
             </w:r>
           </w:p>
         </w:tc>

</xml_diff>

<commit_message>
feat: enregistrement intelligent des livrables a cote de la video, notification visuelle et deck 10 slides humanise
</commit_message>
<xml_diff>
--- a/demo/output/article_mode_d_emploi.docx
+++ b/demo/output/article_mode_d_emploi.docx
@@ -12,7 +12,7 @@
           <w:color w:val="1E3A8A"/>
           <w:sz w:val="44"/>
         </w:rPr>
-        <w:t>Stratégies pour Développer la Créativité</w:t>
+        <w:t>Stratégies pour stimuler la créativité</w:t>
       </w:r>
     </w:p>
     <w:p>
@@ -25,7 +25,7 @@
           <w:color w:val="64748B"/>
           <w:sz w:val="22"/>
         </w:rPr>
-        <w:t>Stratégies de créativité, date, Zoe Hames et Chris Lewis</w:t>
+        <w:t>Session animée par Zoe Hames</w:t>
       </w:r>
     </w:p>
     <w:p>
@@ -39,7 +39,7 @@
           <w:color w:val="1E3A8A"/>
           <w:sz w:val="32"/>
         </w:rPr>
-        <w:t>Trouver le Silence dans le Chaos</w:t>
+        <w:t>1. Importance du Silence</w:t>
       </w:r>
     </w:p>
     <w:p>
@@ -51,7 +51,7 @@
           <w:color w:val="334155"/>
           <w:sz w:val="22"/>
         </w:rPr>
-        <w:t>Zoe Hames insiste sur la nécessité de moments de calme pour favoriser la créativité. Dans un monde bruyant, le silence devient essentiel pour laisser place à l'inspiration.</w:t>
+        <w:t>Dans un monde saturé de stimuli, trouver des moments de silence est crucial pour la créativité. Ces instants permettent de se reconnecter à soi-même et d'accéder à des idées nouvelles.</w:t>
       </w:r>
     </w:p>
     <w:p>
@@ -63,7 +63,7 @@
           <w:color w:val="334155"/>
           <w:sz w:val="22"/>
         </w:rPr>
-        <w:t>Elle évoque l'exemple de Gamora, qui a dû se concentrer intensément pour maîtriser son art. De même, la créativité nécessite un espace pour se développer, loin des distractions.</w:t>
+        <w:t>Chris Lewis souligne que la créativité nécessite un espace pour se développer, loin des distractions constantes.</w:t>
       </w:r>
     </w:p>
     <w:p>
@@ -89,7 +89,7 @@
           <w:color w:val="334155"/>
           <w:sz w:val="21"/>
         </w:rPr>
-        <w:t>Prendre des promenades dans la nature pour se reconnecter aux sensations.</w:t>
+        <w:t>Pratiquer des activités en pleine nature pour favoriser la réflexion.</w:t>
       </w:r>
     </w:p>
     <w:tbl>
@@ -117,7 +117,7 @@
                 <w:color w:val="0284C7"/>
                 <w:sz w:val="20"/>
               </w:rPr>
-              <w:t>📌 Créer des moments de silence aide à libérer l'esprit.</w:t>
+              <w:t>📌 Le silence est un terrain fertile pour l'inspiration.</w:t>
             </w:r>
           </w:p>
         </w:tc>
@@ -193,7 +193,7 @@
           <w:color w:val="1E3A8A"/>
           <w:sz w:val="32"/>
         </w:rPr>
-        <w:t>Exploiter le Pouvoir des Rêves</w:t>
+        <w:t>2. Explorer le Pouvoir des Rêves</w:t>
       </w:r>
     </w:p>
     <w:p>
@@ -205,7 +205,7 @@
           <w:color w:val="334155"/>
           <w:sz w:val="22"/>
         </w:rPr>
-        <w:t>Zoe Hames encourage à retrouver l'énergie imaginative de l'enfance. Elle souligne l'importance de laisser libre cours à ses pensées sans jugement.</w:t>
+        <w:t>Les rêves, qu'ils soient nocturnes ou diurnes, offrent une source inépuisable d'inspiration. Ils permettent d'accéder à une créativité sans limites, semblable à celle de l'enfance.</w:t>
       </w:r>
     </w:p>
     <w:p>
@@ -217,7 +217,7 @@
           <w:color w:val="334155"/>
           <w:sz w:val="22"/>
         </w:rPr>
-        <w:t>Les idées les plus folles peuvent mener à des innovations significatives. En se permettant de rêver, on peut découvrir des trésors cachés dans notre créativité.</w:t>
+        <w:t>Encourager la pensée libre et l'absence de jugement est essentiel pour libérer l'imagination.</w:t>
       </w:r>
     </w:p>
     <w:p>
@@ -230,7 +230,7 @@
           <w:color w:val="334155"/>
           <w:sz w:val="21"/>
         </w:rPr>
-        <w:t>Doodler, rêver éveillé et noter toutes les idées, même les plus absurdes.</w:t>
+        <w:t>S'autoriser à jouer et à explorer des idées sans contraintes.</w:t>
       </w:r>
     </w:p>
     <w:p>
@@ -243,7 +243,7 @@
           <w:color w:val="334155"/>
           <w:sz w:val="21"/>
         </w:rPr>
-        <w:t>Explorer son imagination comme un univers à découvrir.</w:t>
+        <w:t>Tenir un journal des rêves pour capturer des inspirations inattendues.</w:t>
       </w:r>
     </w:p>
     <w:tbl>
@@ -271,7 +271,7 @@
                 <w:color w:val="0284C7"/>
                 <w:sz w:val="20"/>
               </w:rPr>
-              <w:t>📌 Les rêves peuvent révéler des désirs et des peurs cachés.</w:t>
+              <w:t>📌 Les idées les plus innovantes peuvent surgir des pensées les plus absurdes.</w:t>
             </w:r>
           </w:p>
         </w:tc>
@@ -347,7 +347,7 @@
           <w:color w:val="1E3A8A"/>
           <w:sz w:val="32"/>
         </w:rPr>
-        <w:t>L'Art de Laisser Aller</w:t>
+        <w:t>3. Lâcher Prise pour Favoriser la Créativité</w:t>
       </w:r>
     </w:p>
     <w:p>
@@ -359,7 +359,7 @@
           <w:color w:val="334155"/>
           <w:sz w:val="22"/>
         </w:rPr>
-        <w:t>Zoe Hames aborde l'importance de lâcher prise pour favoriser la créativité. Elle explique que parfois, il faut accepter de ne pas tout contrôler.</w:t>
+        <w:t>Lâcher prise est une compétence essentielle pour stimuler la créativité. Cela implique de renoncer à la nécessité de tout contrôler et d'accepter l'incertitude.</w:t>
       </w:r>
     </w:p>
     <w:p>
@@ -371,7 +371,7 @@
           <w:color w:val="334155"/>
           <w:sz w:val="22"/>
         </w:rPr>
-        <w:t>En priorisant nos besoins fondamentaux, comme le sommeil et la nutrition, nous créons un environnement où la créativité peut s'épanouir.</w:t>
+        <w:t>Chris Lewis insiste sur l'importance de prendre soin de soi pour maintenir un niveau créatif optimal.</w:t>
       </w:r>
     </w:p>
     <w:p>
@@ -384,7 +384,7 @@
           <w:color w:val="334155"/>
           <w:sz w:val="21"/>
         </w:rPr>
-        <w:t>Établir des limites et dire non aux activités épuisantes.</w:t>
+        <w:t>Établir des limites pour préserver son énergie.</w:t>
       </w:r>
     </w:p>
     <w:p>
@@ -397,7 +397,7 @@
           <w:color w:val="334155"/>
           <w:sz w:val="21"/>
         </w:rPr>
-        <w:t>Accorder du temps à des activités joyeuses qui nourrissent l'âme.</w:t>
+        <w:t>Accorder la priorité à des activités qui nourrissent l'esprit et le corps.</w:t>
       </w:r>
     </w:p>
     <w:tbl>
@@ -425,7 +425,7 @@
                 <w:color w:val="0284C7"/>
                 <w:sz w:val="20"/>
               </w:rPr>
-              <w:t>📌 Prendre soin de soi est essentiel pour libérer sa créativité.</w:t>
+              <w:t>📌 La créativité prospère dans un environnement où l'on se sent en sécurité et nourri.</w:t>
             </w:r>
           </w:p>
         </w:tc>
@@ -488,6 +488,314 @@
           <w:sz w:val="18"/>
         </w:rPr>
         <w:t>Illustration : slide_keyframe_03.jpg</w:t>
+      </w:r>
+    </w:p>
+    <w:p>
+      <w:pPr>
+        <w:pStyle w:val="Heading1"/>
+        <w:spacing w:before="320" w:after="160"/>
+      </w:pPr>
+      <w:r>
+        <w:rPr>
+          <w:b/>
+          <w:color w:val="1E3A8A"/>
+          <w:sz w:val="32"/>
+        </w:rPr>
+        <w:t>4. Pratiques Quotidiennes pour Stimuler la Créativité</w:t>
+      </w:r>
+    </w:p>
+    <w:p>
+      <w:pPr>
+        <w:spacing w:line="288" w:lineRule="auto" w:after="160"/>
+      </w:pPr>
+      <w:r>
+        <w:rPr>
+          <w:color w:val="334155"/>
+          <w:sz w:val="22"/>
+        </w:rPr>
+        <w:t>Intégrer ces stratégies dans la vie quotidienne peut sembler difficile, mais des actions simples peuvent avoir un impact significatif.</w:t>
+      </w:r>
+    </w:p>
+    <w:p>
+      <w:pPr>
+        <w:spacing w:line="288" w:lineRule="auto" w:after="160"/>
+      </w:pPr>
+      <w:r>
+        <w:rPr>
+          <w:color w:val="334155"/>
+          <w:sz w:val="22"/>
+        </w:rPr>
+        <w:t>Créer des rituels de déconnexion et de réflexion peut aider à établir un cadre propice à la créativité.</w:t>
+      </w:r>
+    </w:p>
+    <w:p>
+      <w:pPr>
+        <w:pStyle w:val="ListBullet"/>
+        <w:spacing w:after="80"/>
+      </w:pPr>
+      <w:r>
+        <w:rPr>
+          <w:color w:val="334155"/>
+          <w:sz w:val="21"/>
+        </w:rPr>
+        <w:t>Planifier des moments de silence dans son emploi du temps.</w:t>
+      </w:r>
+    </w:p>
+    <w:p>
+      <w:pPr>
+        <w:pStyle w:val="ListBullet"/>
+        <w:spacing w:after="80"/>
+      </w:pPr>
+      <w:r>
+        <w:rPr>
+          <w:color w:val="334155"/>
+          <w:sz w:val="21"/>
+        </w:rPr>
+        <w:t>Participer à des activités artistiques ou ludiques régulièrement.</w:t>
+      </w:r>
+    </w:p>
+    <w:tbl>
+      <w:tblPr>
+        <w:tblW w:type="auto" w:w="0"/>
+        <w:jc w:val="center"/>
+        <w:tblLook w:firstColumn="1" w:firstRow="1" w:lastColumn="0" w:lastRow="0" w:noHBand="0" w:noVBand="1" w:val="04A0"/>
+      </w:tblPr>
+      <w:tblGrid>
+        <w:gridCol w:w="9360"/>
+      </w:tblGrid>
+      <w:tr>
+        <w:tc>
+          <w:tcPr>
+            <w:tcW w:type="dxa" w:w="9360"/>
+            <w:shd w:fill="EFF6FF"/>
+          </w:tcPr>
+          <w:p>
+            <w:pPr>
+              <w:spacing w:after="40"/>
+            </w:pPr>
+            <w:r>
+              <w:rPr>
+                <w:i/>
+                <w:color w:val="0284C7"/>
+                <w:sz w:val="20"/>
+              </w:rPr>
+              <w:t>📌 Des rituels simples peuvent transformer votre approche de la créativité.</w:t>
+            </w:r>
+          </w:p>
+        </w:tc>
+      </w:tr>
+    </w:tbl>
+    <w:p>
+      <w:pPr>
+        <w:spacing w:after="160"/>
+      </w:pPr>
+    </w:p>
+    <w:p>
+      <w:pPr>
+        <w:spacing w:before="160" w:after="80"/>
+        <w:jc w:val="center"/>
+      </w:pPr>
+      <w:r>
+        <w:drawing>
+          <wp:inline xmlns:a="http://schemas.openxmlformats.org/drawingml/2006/main" xmlns:pic="http://schemas.openxmlformats.org/drawingml/2006/picture">
+            <wp:extent cx="5029200" cy="2826717"/>
+            <wp:docPr id="4" name="Picture 4"/>
+            <wp:cNvGraphicFramePr>
+              <a:graphicFrameLocks noChangeAspect="1"/>
+            </wp:cNvGraphicFramePr>
+            <a:graphic>
+              <a:graphicData uri="http://schemas.openxmlformats.org/drawingml/2006/picture">
+                <pic:pic>
+                  <pic:nvPicPr>
+                    <pic:cNvPr id="0" name="slide_keyframe_04.jpg"/>
+                    <pic:cNvPicPr/>
+                  </pic:nvPicPr>
+                  <pic:blipFill>
+                    <a:blip r:embed="rId12"/>
+                    <a:stretch>
+                      <a:fillRect/>
+                    </a:stretch>
+                  </pic:blipFill>
+                  <pic:spPr>
+                    <a:xfrm>
+                      <a:off x="0" y="0"/>
+                      <a:ext cx="5029200" cy="2826717"/>
+                    </a:xfrm>
+                    <a:prstGeom prst="rect"/>
+                  </pic:spPr>
+                </pic:pic>
+              </a:graphicData>
+            </a:graphic>
+          </wp:inline>
+        </w:drawing>
+      </w:r>
+    </w:p>
+    <w:p>
+      <w:pPr>
+        <w:spacing w:after="240"/>
+        <w:jc w:val="center"/>
+      </w:pPr>
+      <w:r>
+        <w:rPr>
+          <w:i/>
+          <w:color w:val="64748B"/>
+          <w:sz w:val="18"/>
+        </w:rPr>
+        <w:t>Illustration : slide_keyframe_04.jpg</w:t>
+      </w:r>
+    </w:p>
+    <w:p>
+      <w:pPr>
+        <w:pStyle w:val="Heading1"/>
+        <w:spacing w:before="320" w:after="160"/>
+      </w:pPr>
+      <w:r>
+        <w:rPr>
+          <w:b/>
+          <w:color w:val="1E3A8A"/>
+          <w:sz w:val="32"/>
+        </w:rPr>
+        <w:t>5. Conclusion et Prochaines Étapes</w:t>
+      </w:r>
+    </w:p>
+    <w:p>
+      <w:pPr>
+        <w:spacing w:line="288" w:lineRule="auto" w:after="160"/>
+      </w:pPr>
+      <w:r>
+        <w:rPr>
+          <w:color w:val="334155"/>
+          <w:sz w:val="22"/>
+        </w:rPr>
+        <w:t>Ces stratégies offrent un cadre pour explorer et développer la créativité. En les appliquant, chacun peut espérer retrouver un accès à son potentiel créatif.</w:t>
+      </w:r>
+    </w:p>
+    <w:p>
+      <w:pPr>
+        <w:spacing w:line="288" w:lineRule="auto" w:after="160"/>
+      </w:pPr>
+      <w:r>
+        <w:rPr>
+          <w:color w:val="334155"/>
+          <w:sz w:val="22"/>
+        </w:rPr>
+        <w:t>Il est important de rester ouvert aux nouvelles idées et de ne pas craindre l'expérimentation.</w:t>
+      </w:r>
+    </w:p>
+    <w:p>
+      <w:pPr>
+        <w:pStyle w:val="ListBullet"/>
+        <w:spacing w:after="80"/>
+      </w:pPr>
+      <w:r>
+        <w:rPr>
+          <w:color w:val="334155"/>
+          <w:sz w:val="21"/>
+        </w:rPr>
+        <w:t>Évaluer régulièrement ses progrès créatifs.</w:t>
+      </w:r>
+    </w:p>
+    <w:p>
+      <w:pPr>
+        <w:pStyle w:val="ListBullet"/>
+        <w:spacing w:after="80"/>
+      </w:pPr>
+      <w:r>
+        <w:rPr>
+          <w:color w:val="334155"/>
+          <w:sz w:val="21"/>
+        </w:rPr>
+        <w:t>S'engager à pratiquer ces stratégies sur le long terme.</w:t>
+      </w:r>
+    </w:p>
+    <w:tbl>
+      <w:tblPr>
+        <w:tblW w:type="auto" w:w="0"/>
+        <w:jc w:val="center"/>
+        <w:tblLook w:firstColumn="1" w:firstRow="1" w:lastColumn="0" w:lastRow="0" w:noHBand="0" w:noVBand="1" w:val="04A0"/>
+      </w:tblPr>
+      <w:tblGrid>
+        <w:gridCol w:w="9360"/>
+      </w:tblGrid>
+      <w:tr>
+        <w:tc>
+          <w:tcPr>
+            <w:tcW w:type="dxa" w:w="9360"/>
+            <w:shd w:fill="EFF6FF"/>
+          </w:tcPr>
+          <w:p>
+            <w:pPr>
+              <w:spacing w:after="40"/>
+            </w:pPr>
+            <w:r>
+              <w:rPr>
+                <w:i/>
+                <w:color w:val="0284C7"/>
+                <w:sz w:val="20"/>
+              </w:rPr>
+              <w:t>📌 La créativité est un voyage, pas une destination.</w:t>
+            </w:r>
+          </w:p>
+        </w:tc>
+      </w:tr>
+    </w:tbl>
+    <w:p>
+      <w:pPr>
+        <w:spacing w:after="160"/>
+      </w:pPr>
+    </w:p>
+    <w:p>
+      <w:pPr>
+        <w:spacing w:before="160" w:after="80"/>
+        <w:jc w:val="center"/>
+      </w:pPr>
+      <w:r>
+        <w:drawing>
+          <wp:inline xmlns:a="http://schemas.openxmlformats.org/drawingml/2006/main" xmlns:pic="http://schemas.openxmlformats.org/drawingml/2006/picture">
+            <wp:extent cx="5029200" cy="2826717"/>
+            <wp:docPr id="5" name="Picture 5"/>
+            <wp:cNvGraphicFramePr>
+              <a:graphicFrameLocks noChangeAspect="1"/>
+            </wp:cNvGraphicFramePr>
+            <a:graphic>
+              <a:graphicData uri="http://schemas.openxmlformats.org/drawingml/2006/picture">
+                <pic:pic>
+                  <pic:nvPicPr>
+                    <pic:cNvPr id="0" name="slide_keyframe_05.jpg"/>
+                    <pic:cNvPicPr/>
+                  </pic:nvPicPr>
+                  <pic:blipFill>
+                    <a:blip r:embed="rId13"/>
+                    <a:stretch>
+                      <a:fillRect/>
+                    </a:stretch>
+                  </pic:blipFill>
+                  <pic:spPr>
+                    <a:xfrm>
+                      <a:off x="0" y="0"/>
+                      <a:ext cx="5029200" cy="2826717"/>
+                    </a:xfrm>
+                    <a:prstGeom prst="rect"/>
+                  </pic:spPr>
+                </pic:pic>
+              </a:graphicData>
+            </a:graphic>
+          </wp:inline>
+        </w:drawing>
+      </w:r>
+    </w:p>
+    <w:p>
+      <w:pPr>
+        <w:spacing w:after="240"/>
+        <w:jc w:val="center"/>
+      </w:pPr>
+      <w:r>
+        <w:rPr>
+          <w:i/>
+          <w:color w:val="64748B"/>
+          <w:sz w:val="18"/>
+        </w:rPr>
+        <w:t>Illustration : slide_keyframe_05.jpg</w:t>
       </w:r>
     </w:p>
     <w:sectPr>

</xml_diff>

<commit_message>
feat(finops): module d evaluation des couts, support utf-8 natif et 23 tests automatises
</commit_message>
<xml_diff>
--- a/demo/output/article_mode_d_emploi.docx
+++ b/demo/output/article_mode_d_emploi.docx
@@ -25,7 +25,7 @@
           <w:color w:val="64748B"/>
           <w:sz w:val="22"/>
         </w:rPr>
-        <w:t>Session animée par Zoe Hames</w:t>
+        <w:t>Session sur les Stratégies Créatives avec Zoe Hames</w:t>
       </w:r>
     </w:p>
     <w:p>
@@ -39,7 +39,7 @@
           <w:color w:val="1E3A8A"/>
           <w:sz w:val="32"/>
         </w:rPr>
-        <w:t>1. Importance du Silence</w:t>
+        <w:t>1. Importance du Calme dans un Monde Distrayant</w:t>
       </w:r>
     </w:p>
     <w:p>
@@ -51,7 +51,7 @@
           <w:color w:val="334155"/>
           <w:sz w:val="22"/>
         </w:rPr>
-        <w:t>Dans un monde saturé de stimuli, trouver des moments de silence est crucial pour la créativité. Ces instants permettent de se reconnecter à soi-même et d'accéder à des idées nouvelles.</w:t>
+        <w:t>La recherche de moments de silence est essentielle pour stimuler la créativité. il importe de se déconnecter pour permettre à l'esprit de s'épanouir.</w:t>
       </w:r>
     </w:p>
     <w:p>
@@ -63,7 +63,7 @@
           <w:color w:val="334155"/>
           <w:sz w:val="22"/>
         </w:rPr>
-        <w:t>Chris Lewis souligne que la créativité nécessite un espace pour se développer, loin des distractions constantes.</w:t>
+        <w:t>Les moments de calme favorisent l'inspiration et permettent de se reconnecter à soi-même.</w:t>
       </w:r>
     </w:p>
     <w:p>
@@ -76,7 +76,7 @@
           <w:color w:val="334155"/>
           <w:sz w:val="21"/>
         </w:rPr>
-        <w:t>Consacrer quelques minutes chaque jour à la déconnexion.</w:t>
+        <w:t>Carver du temps quotidien pour le silence</w:t>
       </w:r>
     </w:p>
     <w:p>
@@ -89,7 +89,7 @@
           <w:color w:val="334155"/>
           <w:sz w:val="21"/>
         </w:rPr>
-        <w:t>Pratiquer des activités en pleine nature pour favoriser la réflexion.</w:t>
+        <w:t>Pratiquer des activités en pleine nature</w:t>
       </w:r>
     </w:p>
     <w:tbl>
@@ -117,7 +117,7 @@
                 <w:color w:val="0284C7"/>
                 <w:sz w:val="20"/>
               </w:rPr>
-              <w:t>📌 Le silence est un terrain fertile pour l'inspiration.</w:t>
+              <w:t>📌 Créer des rituels de déconnexion peut aider à retrouver sa créativité.</w:t>
             </w:r>
           </w:p>
         </w:tc>
@@ -193,7 +193,7 @@
           <w:color w:val="1E3A8A"/>
           <w:sz w:val="32"/>
         </w:rPr>
-        <w:t>2. Explorer le Pouvoir des Rêves</w:t>
+        <w:t>2. Exploiter le Pouvoir des Rêves</w:t>
       </w:r>
     </w:p>
     <w:p>
@@ -205,7 +205,7 @@
           <w:color w:val="334155"/>
           <w:sz w:val="22"/>
         </w:rPr>
-        <w:t>Les rêves, qu'ils soient nocturnes ou diurnes, offrent une source inépuisable d'inspiration. Ils permettent d'accéder à une créativité sans limites, semblable à celle de l'enfance.</w:t>
+        <w:t>Les rêves, qu'ils soient nocturnes ou diurnes, sont une source inestimable d'inspiration. Ils permettent d'accéder à une créativité sans limites, en libérant l'imagination.</w:t>
       </w:r>
     </w:p>
     <w:p>
@@ -217,7 +217,7 @@
           <w:color w:val="334155"/>
           <w:sz w:val="22"/>
         </w:rPr>
-        <w:t>Encourager la pensée libre et l'absence de jugement est essentiel pour libérer l'imagination.</w:t>
+        <w:t>Encourager une pensée libre et sans jugement peut mener à des idées innovantes.</w:t>
       </w:r>
     </w:p>
     <w:p>
@@ -230,7 +230,7 @@
           <w:color w:val="334155"/>
           <w:sz w:val="21"/>
         </w:rPr>
-        <w:t>S'autoriser à jouer et à explorer des idées sans contraintes.</w:t>
+        <w:t>Accorder du temps à des activités ludiques</w:t>
       </w:r>
     </w:p>
     <w:p>
@@ -243,7 +243,7 @@
           <w:color w:val="334155"/>
           <w:sz w:val="21"/>
         </w:rPr>
-        <w:t>Tenir un journal des rêves pour capturer des inspirations inattendues.</w:t>
+        <w:t>Noter les idées sans autocensure</w:t>
       </w:r>
     </w:p>
     <w:tbl>
@@ -271,7 +271,7 @@
                 <w:color w:val="0284C7"/>
                 <w:sz w:val="20"/>
               </w:rPr>
-              <w:t>📌 Les idées les plus innovantes peuvent surgir des pensées les plus absurdes.</w:t>
+              <w:t>📌 La créativité peut être nourrie par des moments de jeu et de rêverie.</w:t>
             </w:r>
           </w:p>
         </w:tc>
@@ -347,7 +347,7 @@
           <w:color w:val="1E3A8A"/>
           <w:sz w:val="32"/>
         </w:rPr>
-        <w:t>3. Lâcher Prise pour Favoriser la Créativité</w:t>
+        <w:t>3. L'Art de Lâcher Prise</w:t>
       </w:r>
     </w:p>
     <w:p>
@@ -359,7 +359,7 @@
           <w:color w:val="334155"/>
           <w:sz w:val="22"/>
         </w:rPr>
-        <w:t>Lâcher prise est une compétence essentielle pour stimuler la créativité. Cela implique de renoncer à la nécessité de tout contrôler et d'accepter l'incertitude.</w:t>
+        <w:t>Lâcher prise est une compétence essentielle pour favoriser la créativité. Cela implique d'abandonner le besoin de tout contrôler et de laisser l'esprit vagabonder.</w:t>
       </w:r>
     </w:p>
     <w:p>
@@ -371,7 +371,7 @@
           <w:color w:val="334155"/>
           <w:sz w:val="22"/>
         </w:rPr>
-        <w:t>Chris Lewis insiste sur l'importance de prendre soin de soi pour maintenir un niveau créatif optimal.</w:t>
+        <w:t>Prioriser le bien-être physique et mental est fondamental pour maintenir une créativité florissante.</w:t>
       </w:r>
     </w:p>
     <w:p>
@@ -384,7 +384,7 @@
           <w:color w:val="334155"/>
           <w:sz w:val="21"/>
         </w:rPr>
-        <w:t>Établir des limites pour préserver son énergie.</w:t>
+        <w:t>Établir des limites claires pour éviter l'épuisement</w:t>
       </w:r>
     </w:p>
     <w:p>
@@ -397,7 +397,7 @@
           <w:color w:val="334155"/>
           <w:sz w:val="21"/>
         </w:rPr>
-        <w:t>Accorder la priorité à des activités qui nourrissent l'esprit et le corps.</w:t>
+        <w:t>S'accorder des pauses régulières</w:t>
       </w:r>
     </w:p>
     <w:tbl>
@@ -425,7 +425,7 @@
                 <w:color w:val="0284C7"/>
                 <w:sz w:val="20"/>
               </w:rPr>
-              <w:t>📌 La créativité prospère dans un environnement où l'on se sent en sécurité et nourri.</w:t>
+              <w:t>📌 Le lâcher-prise permet d'accéder à une créativité authentique.</w:t>
             </w:r>
           </w:p>
         </w:tc>
@@ -513,7 +513,7 @@
           <w:color w:val="334155"/>
           <w:sz w:val="22"/>
         </w:rPr>
-        <w:t>Intégrer ces stratégies dans la vie quotidienne peut sembler difficile, mais des actions simples peuvent avoir un impact significatif.</w:t>
+        <w:t>Intégrer des pratiques quotidiennes qui favorisent le calme et la créativité est crucial. Cela peut inclure la méditation, la marche ou simplement des moments de réflexion.</w:t>
       </w:r>
     </w:p>
     <w:p>
@@ -525,7 +525,7 @@
           <w:color w:val="334155"/>
           <w:sz w:val="22"/>
         </w:rPr>
-        <w:t>Créer des rituels de déconnexion et de réflexion peut aider à établir un cadre propice à la créativité.</w:t>
+        <w:t>Ces activités aident à créer un environnement propice à l'émergence d'idées nouvelles.</w:t>
       </w:r>
     </w:p>
     <w:p>
@@ -538,7 +538,7 @@
           <w:color w:val="334155"/>
           <w:sz w:val="21"/>
         </w:rPr>
-        <w:t>Planifier des moments de silence dans son emploi du temps.</w:t>
+        <w:t>Méditation quotidienne</w:t>
       </w:r>
     </w:p>
     <w:p>
@@ -551,7 +551,7 @@
           <w:color w:val="334155"/>
           <w:sz w:val="21"/>
         </w:rPr>
-        <w:t>Participer à des activités artistiques ou ludiques régulièrement.</w:t>
+        <w:t>Balades en pleine nature</w:t>
       </w:r>
     </w:p>
     <w:tbl>
@@ -579,7 +579,7 @@
                 <w:color w:val="0284C7"/>
                 <w:sz w:val="20"/>
               </w:rPr>
-              <w:t>📌 Des rituels simples peuvent transformer votre approche de la créativité.</w:t>
+              <w:t>📌 Des rituels simples peuvent transformer votre approche créative.</w:t>
             </w:r>
           </w:p>
         </w:tc>
@@ -667,7 +667,7 @@
           <w:color w:val="334155"/>
           <w:sz w:val="22"/>
         </w:rPr>
-        <w:t>Ces stratégies offrent un cadre pour explorer et développer la créativité. En les appliquant, chacun peut espérer retrouver un accès à son potentiel créatif.</w:t>
+        <w:t>En appliquant ces stratégies, chacun peut retrouver sa créativité. Il est important de se rappeler que la créativité est un voyage, pas une destination.</w:t>
       </w:r>
     </w:p>
     <w:p>
@@ -679,7 +679,7 @@
           <w:color w:val="334155"/>
           <w:sz w:val="22"/>
         </w:rPr>
-        <w:t>Il est important de rester ouvert aux nouvelles idées et de ne pas craindre l'expérimentation.</w:t>
+        <w:t>Encourager l'expérimentation et l'acceptation des erreurs est essentiel pour progresser.</w:t>
       </w:r>
     </w:p>
     <w:p>
@@ -692,7 +692,7 @@
           <w:color w:val="334155"/>
           <w:sz w:val="21"/>
         </w:rPr>
-        <w:t>Évaluer régulièrement ses progrès créatifs.</w:t>
+        <w:t>Mettre en pratique ces stratégies régulièrement</w:t>
       </w:r>
     </w:p>
     <w:p>
@@ -705,7 +705,7 @@
           <w:color w:val="334155"/>
           <w:sz w:val="21"/>
         </w:rPr>
-        <w:t>S'engager à pratiquer ces stratégies sur le long terme.</w:t>
+        <w:t>S'engager dans un processus d'apprentissage continu</w:t>
       </w:r>
     </w:p>
     <w:tbl>
@@ -733,7 +733,7 @@
                 <w:color w:val="0284C7"/>
                 <w:sz w:val="20"/>
               </w:rPr>
-              <w:t>📌 La créativité est un voyage, pas une destination.</w:t>
+              <w:t>📌 La créativité s'épanouit dans un environnement d'expérimentation et de liberté.</w:t>
             </w:r>
           </w:p>
         </w:tc>

</xml_diff>

<commit_message>
fix(cli): correction de l'import tqdm au niveau global, assainissement des fichiers bat et mise a jour de la commande registre Windows
</commit_message>
<xml_diff>
--- a/demo/output/article_mode_d_emploi.docx
+++ b/demo/output/article_mode_d_emploi.docx
@@ -12,7 +12,7 @@
           <w:color w:val="1E3A8A"/>
           <w:sz w:val="44"/>
         </w:rPr>
-        <w:t>Stratégies pour stimuler la créativité</w:t>
+        <w:t>stimuler la créativité : Stratégies Pratiques</w:t>
       </w:r>
     </w:p>
     <w:p>
@@ -25,7 +25,7 @@
           <w:color w:val="64748B"/>
           <w:sz w:val="22"/>
         </w:rPr>
-        <w:t>Session sur les Stratégies Créatives avec Zoe Hames</w:t>
+        <w:t>Stratégies pour Libérer l'Innovation et la Créativité</w:t>
       </w:r>
     </w:p>
     <w:p>
@@ -39,7 +39,7 @@
           <w:color w:val="1E3A8A"/>
           <w:sz w:val="32"/>
         </w:rPr>
-        <w:t>1. Importance du Calme dans un Monde Distrayant</w:t>
+        <w:t>1. L'Importance du Silence</w:t>
       </w:r>
     </w:p>
     <w:p>
@@ -51,7 +51,7 @@
           <w:color w:val="334155"/>
           <w:sz w:val="22"/>
         </w:rPr>
-        <w:t>La recherche de moments de silence est essentielle pour stimuler la créativité. il importe de se déconnecter pour permettre à l'esprit de s'épanouir.</w:t>
+        <w:t>le silence devient une denrée rare. Zoe Hames souligne que la créativité nécessite des moments de calme pour s'épanouir. En effet, le bruit constant des notifications et des interactions sociales peut étouffer notre capacité à penser de manière créative. Les recherches montrent que les périodes de silence permettent au cerveau de se recharger et de faire des connexions nouvelles, essentielles pour l'innovation.</w:t>
       </w:r>
     </w:p>
     <w:p>
@@ -63,7 +63,19 @@
           <w:color w:val="334155"/>
           <w:sz w:val="22"/>
         </w:rPr>
-        <w:t>Les moments de calme favorisent l'inspiration et permettent de se reconnecter à soi-même.</w:t>
+        <w:t>Les mécanismes sous-jacents à cette nécessité de silence incluent la réduction du stress et l'amélioration de la concentration. En se déconnectant des distractions, les individus sont en mesure de se reconnecter à leurs pensées et à leur intuition. Cela favorise non seulement la créativité, mais aussi le bien-être général, ce qui est crucial dans des environnements de travail exigeants.</w:t>
+      </w:r>
+    </w:p>
+    <w:p>
+      <w:pPr>
+        <w:spacing w:line="288" w:lineRule="auto" w:after="160"/>
+      </w:pPr>
+      <w:r>
+        <w:rPr>
+          <w:color w:val="334155"/>
+          <w:sz w:val="22"/>
+        </w:rPr>
+        <w:t>Pour mettre en œuvre cette stratégie, il est recommandé de créer des rituels quotidiens dédiés au silence. Cela peut impliquer des pauses régulières sans technologie ou des moments de méditation. Les équipes peuvent également instaurer des périodes de travail sans interruption pour favoriser la concentration et l'innovation.</w:t>
       </w:r>
     </w:p>
     <w:p>
@@ -76,7 +88,7 @@
           <w:color w:val="334155"/>
           <w:sz w:val="21"/>
         </w:rPr>
-        <w:t>Carver du temps quotidien pour le silence</w:t>
+        <w:t>Instaurer des moments de silence quotidien pour favoriser la créativité et la concentration, en permettant au cerveau de se recharger.</w:t>
       </w:r>
     </w:p>
     <w:p>
@@ -89,7 +101,20 @@
           <w:color w:val="334155"/>
           <w:sz w:val="21"/>
         </w:rPr>
-        <w:t>Pratiquer des activités en pleine nature</w:t>
+        <w:t>Encourager des rituels d'équipe où le silence est valorisé, permettant ainsi à chacun de se recentrer sur ses idées et ses intuitions.</w:t>
+      </w:r>
+    </w:p>
+    <w:p>
+      <w:pPr>
+        <w:pStyle w:val="ListBullet"/>
+        <w:spacing w:after="80"/>
+      </w:pPr>
+      <w:r>
+        <w:rPr>
+          <w:color w:val="334155"/>
+          <w:sz w:val="21"/>
+        </w:rPr>
+        <w:t>Mesurer l'impact de ces moments de silence sur la productivité et la créativité à travers des indicateurs de performance adaptés.</w:t>
       </w:r>
     </w:p>
     <w:tbl>
@@ -117,7 +142,7 @@
                 <w:color w:val="0284C7"/>
                 <w:sz w:val="20"/>
               </w:rPr>
-              <w:t>📌 Créer des rituels de déconnexion peut aider à retrouver sa créativité.</w:t>
+              <w:t>Note d'analyse : Le silence est un catalyseur essentiel pour la créativité.</w:t>
             </w:r>
           </w:p>
         </w:tc>
@@ -193,7 +218,7 @@
           <w:color w:val="1E3A8A"/>
           <w:sz w:val="32"/>
         </w:rPr>
-        <w:t>2. Exploiter le Pouvoir des Rêves</w:t>
+        <w:t>2. L'Énergie des Rêves : Une Source d'Inspiration</w:t>
       </w:r>
     </w:p>
     <w:p>
@@ -205,7 +230,7 @@
           <w:color w:val="334155"/>
           <w:sz w:val="22"/>
         </w:rPr>
-        <w:t>Les rêves, qu'ils soient nocturnes ou diurnes, sont une source inestimable d'inspiration. Ils permettent d'accéder à une créativité sans limites, en libérant l'imagination.</w:t>
+        <w:t>Zoe Hames évoque l'importance de se reconnecter à l'énergie des rêves, tant ceux vécus pendant le sommeil que ceux éveillés. Cette connexion à l'imaginaire permet d'explorer des idées sans limites, favorisant ainsi l'innovation. Les enfants, par leur capacité naturelle à rêver et à imaginer, représentent un modèle à suivre pour les adultes dans le monde professionnel.</w:t>
       </w:r>
     </w:p>
     <w:p>
@@ -217,7 +242,19 @@
           <w:color w:val="334155"/>
           <w:sz w:val="22"/>
         </w:rPr>
-        <w:t>Encourager une pensée libre et sans jugement peut mener à des idées innovantes.</w:t>
+        <w:t>L'absence de jugement et la liberté de pensée sont des éléments clés pour accéder à cette créativité. En encourageant les équipes à exprimer des idées, même les plus farfelues, on ouvre la porte à des solutions innovantes. Les entreprises qui adoptent cette approche constatent souvent une augmentation de l'engagement et de la satisfaction des employés.</w:t>
+      </w:r>
+    </w:p>
+    <w:p>
+      <w:pPr>
+        <w:spacing w:line="288" w:lineRule="auto" w:after="160"/>
+      </w:pPr>
+      <w:r>
+        <w:rPr>
+          <w:color w:val="334155"/>
+          <w:sz w:val="22"/>
+        </w:rPr>
+        <w:t>Pour exploiter cette stratégie, il importe de créer un environnement où l'expérimentation est valorisée. Cela peut inclure des sessions de brainstorming sans limites, où chaque idée est accueillie sans critique. Les outils créatifs comme le dessin ou l'écriture libre peuvent également être intégrés dans le processus de génération d'idées.</w:t>
       </w:r>
     </w:p>
     <w:p>
@@ -230,7 +267,7 @@
           <w:color w:val="334155"/>
           <w:sz w:val="21"/>
         </w:rPr>
-        <w:t>Accorder du temps à des activités ludiques</w:t>
+        <w:t>Encourager la libre expression des idées au sein des équipes pour stimuler l'innovation et l'engagement.</w:t>
       </w:r>
     </w:p>
     <w:p>
@@ -243,7 +280,20 @@
           <w:color w:val="334155"/>
           <w:sz w:val="21"/>
         </w:rPr>
-        <w:t>Noter les idées sans autocensure</w:t>
+        <w:t>Organiser des sessions de brainstorming où toutes les idées sont acceptées, favorisant ainsi un climat de créativité.</w:t>
+      </w:r>
+    </w:p>
+    <w:p>
+      <w:pPr>
+        <w:pStyle w:val="ListBullet"/>
+        <w:spacing w:after="80"/>
+      </w:pPr>
+      <w:r>
+        <w:rPr>
+          <w:color w:val="334155"/>
+          <w:sz w:val="21"/>
+        </w:rPr>
+        <w:t>Utiliser des techniques créatives comme le doodling ou l'écriture libre pour débloquer la pensée et explorer de nouvelles avenues.</w:t>
       </w:r>
     </w:p>
     <w:tbl>
@@ -271,7 +321,7 @@
                 <w:color w:val="0284C7"/>
                 <w:sz w:val="20"/>
               </w:rPr>
-              <w:t>📌 La créativité peut être nourrie par des moments de jeu et de rêverie.</w:t>
+              <w:t>Note d'analyse : Les rêves et l'imaginaire sont des ressources inexploitées pour l'innovation.</w:t>
             </w:r>
           </w:p>
         </w:tc>
@@ -347,7 +397,7 @@
           <w:color w:val="1E3A8A"/>
           <w:sz w:val="32"/>
         </w:rPr>
-        <w:t>3. L'Art de Lâcher Prise</w:t>
+        <w:t>3. L'Art de Lâcher Prise : Une Nécessité pour Créer</w:t>
       </w:r>
     </w:p>
     <w:p>
@@ -359,7 +409,7 @@
           <w:color w:val="334155"/>
           <w:sz w:val="22"/>
         </w:rPr>
-        <w:t>Lâcher prise est une compétence essentielle pour favoriser la créativité. Cela implique d'abandonner le besoin de tout contrôler et de laisser l'esprit vagabonder.</w:t>
+        <w:t>La dernière stratégie abordée par Zoe Hames est celle du lâcher-prise. apprendre à relâcher le contrôle est essentiel. Cette approche permet de stimuler la créativité, en permettant aux idées de circuler librement sans la contrainte de la perfection.</w:t>
       </w:r>
     </w:p>
     <w:p>
@@ -371,7 +421,19 @@
           <w:color w:val="334155"/>
           <w:sz w:val="22"/>
         </w:rPr>
-        <w:t>Prioriser le bien-être physique et mental est fondamental pour maintenir une créativité florissante.</w:t>
+        <w:t>Chris Lewis souligne que la priorisation des besoins fondamentaux, comme le sommeil et le bien-être, est cruciale pour maintenir un niveau de créativité élevé. Lorsque les individus sont épuisés, leur capacité à innover est compromise. En favorisant un équilibre entre travail et repos, les organisations peuvent stimuler la créativité de leurs employés.</w:t>
+      </w:r>
+    </w:p>
+    <w:p>
+      <w:pPr>
+        <w:spacing w:line="288" w:lineRule="auto" w:after="160"/>
+      </w:pPr>
+      <w:r>
+        <w:rPr>
+          <w:color w:val="334155"/>
+          <w:sz w:val="22"/>
+        </w:rPr>
+        <w:t>Pour intégrer cette stratégie, il est recommandé de mettre en place des politiques de bien-être au travail. Cela peut inclure des horaires flexibles, des programmes de santé mentale et des initiatives qui encouragent les pauses régulières. En créant un environnement où le bien-être est une priorité, les entreprises peuvent voir une amélioration significative de la créativité et de la productivité.</w:t>
       </w:r>
     </w:p>
     <w:p>
@@ -384,7 +446,7 @@
           <w:color w:val="334155"/>
           <w:sz w:val="21"/>
         </w:rPr>
-        <w:t>Établir des limites claires pour éviter l'épuisement</w:t>
+        <w:t>Mettre en place des politiques de bien-être au travail pour favoriser un équilibre entre vie professionnelle et personnelle.</w:t>
       </w:r>
     </w:p>
     <w:p>
@@ -397,7 +459,20 @@
           <w:color w:val="334155"/>
           <w:sz w:val="21"/>
         </w:rPr>
-        <w:t>S'accorder des pauses régulières</w:t>
+        <w:t>Encourager les employés à prendre des pauses régulières pour recharger leurs batteries et stimuler leur créativité.</w:t>
+      </w:r>
+    </w:p>
+    <w:p>
+      <w:pPr>
+        <w:pStyle w:val="ListBullet"/>
+        <w:spacing w:after="80"/>
+      </w:pPr>
+      <w:r>
+        <w:rPr>
+          <w:color w:val="334155"/>
+          <w:sz w:val="21"/>
+        </w:rPr>
+        <w:t>Évaluer l'impact des initiatives de bien-être sur la créativité et la productivité à travers des enquêtes et des indicateurs de performance.</w:t>
       </w:r>
     </w:p>
     <w:tbl>
@@ -425,7 +500,7 @@
                 <w:color w:val="0284C7"/>
                 <w:sz w:val="20"/>
               </w:rPr>
-              <w:t>📌 Le lâcher-prise permet d'accéder à une créativité authentique.</w:t>
+              <w:t>Note d'analyse : Le lâcher-prise est essentiel pour stimuler la créativité.</w:t>
             </w:r>
           </w:p>
         </w:tc>
@@ -501,7 +576,7 @@
           <w:color w:val="1E3A8A"/>
           <w:sz w:val="32"/>
         </w:rPr>
-        <w:t>4. Pratiques Quotidiennes pour Stimuler la Créativité</w:t>
+        <w:t>4. Mise en Pratique des Stratégies Créatives</w:t>
       </w:r>
     </w:p>
     <w:p>
@@ -513,7 +588,7 @@
           <w:color w:val="334155"/>
           <w:sz w:val="22"/>
         </w:rPr>
-        <w:t>Intégrer des pratiques quotidiennes qui favorisent le calme et la créativité est crucial. Cela peut inclure la méditation, la marche ou simplement des moments de réflexion.</w:t>
+        <w:t>Pour que ces stratégies soient efficaces, il importe de les intégrer dans la culture d'entreprise. Cela nécessite un engagement de la part de la direction pour valoriser la créativité et le bien-être des employés. Les leaders doivent montrer l'exemple en adoptant ces pratiques eux-mêmes.</w:t>
       </w:r>
     </w:p>
     <w:p>
@@ -525,7 +600,19 @@
           <w:color w:val="334155"/>
           <w:sz w:val="22"/>
         </w:rPr>
-        <w:t>Ces activités aident à créer un environnement propice à l'émergence d'idées nouvelles.</w:t>
+        <w:t>Les formations et ateliers peuvent également jouer un rôle clé dans la mise en œuvre de ces stratégies. En formant les employés à des techniques de méditation, de brainstorming créatif et de gestion du stress, les entreprises peuvent créer un environnement propice à l'innovation.</w:t>
+      </w:r>
+    </w:p>
+    <w:p>
+      <w:pPr>
+        <w:spacing w:line="288" w:lineRule="auto" w:after="160"/>
+      </w:pPr>
+      <w:r>
+        <w:rPr>
+          <w:color w:val="334155"/>
+          <w:sz w:val="22"/>
+        </w:rPr>
+        <w:t>Enfin, il est important de célébrer les réussites créatives, qu'elles soient grandes ou petites. Cela renforce la motivation des équipes et leur donne la confiance nécessaire pour continuer à explorer de nouvelles idées.</w:t>
       </w:r>
     </w:p>
     <w:p>
@@ -538,7 +625,7 @@
           <w:color w:val="334155"/>
           <w:sz w:val="21"/>
         </w:rPr>
-        <w:t>Méditation quotidienne</w:t>
+        <w:t>Intégrer les stratégies créatives dans la culture d'entreprise pour favoriser un environnement propice à l'innovation.</w:t>
       </w:r>
     </w:p>
     <w:p>
@@ -551,7 +638,20 @@
           <w:color w:val="334155"/>
           <w:sz w:val="21"/>
         </w:rPr>
-        <w:t>Balades en pleine nature</w:t>
+        <w:t>Proposer des formations sur des techniques de créativité et de gestion du stress pour outiller les employés.</w:t>
+      </w:r>
+    </w:p>
+    <w:p>
+      <w:pPr>
+        <w:pStyle w:val="ListBullet"/>
+        <w:spacing w:after="80"/>
+      </w:pPr>
+      <w:r>
+        <w:rPr>
+          <w:color w:val="334155"/>
+          <w:sz w:val="21"/>
+        </w:rPr>
+        <w:t>Célébrer les réussites créatives pour encourager la prise de risque et l'innovation au sein des équipes.</w:t>
       </w:r>
     </w:p>
     <w:tbl>
@@ -579,7 +679,7 @@
                 <w:color w:val="0284C7"/>
                 <w:sz w:val="20"/>
               </w:rPr>
-              <w:t>📌 Des rituels simples peuvent transformer votre approche créative.</w:t>
+              <w:t>Note d'analyse : L'intégration des stratégies créatives nécessite un engagement collectif.</w:t>
             </w:r>
           </w:p>
         </w:tc>
@@ -655,7 +755,7 @@
           <w:color w:val="1E3A8A"/>
           <w:sz w:val="32"/>
         </w:rPr>
-        <w:t>5. Conclusion et Prochaines Étapes</w:t>
+        <w:t>5. Évaluation de l'Impact des Stratégies sur la Créativité</w:t>
       </w:r>
     </w:p>
     <w:p>
@@ -667,7 +767,7 @@
           <w:color w:val="334155"/>
           <w:sz w:val="22"/>
         </w:rPr>
-        <w:t>En appliquant ces stratégies, chacun peut retrouver sa créativité. Il est important de se rappeler que la créativité est un voyage, pas une destination.</w:t>
+        <w:t>Pour mesurer l'efficacité des stratégies mises en œuvre, il importe de définir des indicateurs de performance clairs. Cela peut inclure des métriques sur la satisfaction des employés, la qualité des idées générées et l'impact sur les résultats commerciaux.</w:t>
       </w:r>
     </w:p>
     <w:p>
@@ -679,7 +779,19 @@
           <w:color w:val="334155"/>
           <w:sz w:val="22"/>
         </w:rPr>
-        <w:t>Encourager l'expérimentation et l'acceptation des erreurs est essentiel pour progresser.</w:t>
+        <w:t>Les feedbacks réguliers des équipes permettent d'ajuster les pratiques et d'identifier les domaines d'amélioration. En instaurant une culture de retour d'expérience, les entreprises peuvent s'assurer que les stratégies restent pertinentes et efficaces.</w:t>
+      </w:r>
+    </w:p>
+    <w:p>
+      <w:pPr>
+        <w:spacing w:line="288" w:lineRule="auto" w:after="160"/>
+      </w:pPr>
+      <w:r>
+        <w:rPr>
+          <w:color w:val="334155"/>
+          <w:sz w:val="22"/>
+        </w:rPr>
+        <w:t>Enfin, il est important de partager les résultats obtenus avec l'ensemble de l'organisation. Cela renforce l'engagement des employés et montre que les efforts en matière de créativité portent leurs fruits.</w:t>
       </w:r>
     </w:p>
     <w:p>
@@ -692,7 +804,7 @@
           <w:color w:val="334155"/>
           <w:sz w:val="21"/>
         </w:rPr>
-        <w:t>Mettre en pratique ces stratégies régulièrement</w:t>
+        <w:t>Définir des indicateurs de performance pour mesurer l'impact des stratégies créatives sur la satisfaction et l'innovation.</w:t>
       </w:r>
     </w:p>
     <w:p>
@@ -705,7 +817,20 @@
           <w:color w:val="334155"/>
           <w:sz w:val="21"/>
         </w:rPr>
-        <w:t>S'engager dans un processus d'apprentissage continu</w:t>
+        <w:t>Instaurer des feedbacks réguliers pour ajuster les pratiques et améliorer continuellement les processus créatifs.</w:t>
+      </w:r>
+    </w:p>
+    <w:p>
+      <w:pPr>
+        <w:pStyle w:val="ListBullet"/>
+        <w:spacing w:after="80"/>
+      </w:pPr>
+      <w:r>
+        <w:rPr>
+          <w:color w:val="334155"/>
+          <w:sz w:val="21"/>
+        </w:rPr>
+        <w:t>Communiquer les résultats obtenus pour renforcer l'engagement des employés et valoriser les efforts créatifs.</w:t>
       </w:r>
     </w:p>
     <w:tbl>
@@ -733,7 +858,7 @@
                 <w:color w:val="0284C7"/>
                 <w:sz w:val="20"/>
               </w:rPr>
-              <w:t>📌 La créativité s'épanouit dans un environnement d'expérimentation et de liberté.</w:t>
+              <w:t>Note d'analyse : L'évaluation continue est essentielle pour maintenir l'efficacité des stratégies créatives.</w:t>
             </w:r>
           </w:p>
         </w:tc>

</xml_diff>